<commit_message>
Public five-minute investor demo (/demo): Part 1, Part 2 with scripted Guide, sample results and PDF; tests; updated presentation guide
Co-Authored-By: Claude Sonnet 5.5 <noreply@anthropic.com>
Claude-Session: https://claude.ai/code/session_01YUGCWqmNcdSdSqKm1JeTQm
</commit_message>
<xml_diff>
--- a/docs/Excavation_Shareholder_Presentation_Guide.docx
+++ b/docs/Excavation_Shareholder_Presentation_Guide.docx
@@ -1404,7 +1404,7 @@
                 <w:sz w:val="20"/>
                 <w:szCs w:val="20"/>
               </w:rPr>
-              <w:t xml:space="preserve">LIVE DEMO (section 5)</w:t>
+              <w:t xml:space="preserve">LIVE DEMO at /demo (section 5)</w:t>
             </w:r>
           </w:p>
         </w:tc>
@@ -2991,7 +2991,7 @@
         <w:rPr>
           <w:rFonts w:ascii="Calibri" w:cs="Calibri" w:eastAsia="Calibri" w:hAnsi="Calibri"/>
         </w:rPr>
-        <w:t xml:space="preserve">See section 5. Introduce it in one sentence: "This is the production system, not a mock-up."</w:t>
+        <w:t xml:space="preserve">See section 5. Introduce it honestly in one sentence: "This is the real interface with a fictional learner and a scripted Guide, so you can see all three parts in five minutes."</w:t>
       </w:r>
     </w:p>
     <w:p>
@@ -3532,7 +3532,33 @@
           <w:sz w:val="34"/>
           <w:szCs w:val="34"/>
         </w:rPr>
-        <w:t xml:space="preserve">5. The live demo (five minutes)</w:t>
+        <w:t xml:space="preserve">5. The five-minute demo</w:t>
+      </w:r>
+    </w:p>
+    <w:p>
+      <w:pPr>
+        <w:spacing w:after="120" w:line="288"/>
+      </w:pPr>
+      <w:r>
+        <w:rPr>
+          <w:rFonts w:ascii="Calibri" w:cs="Calibri" w:eastAsia="Calibri" w:hAnsi="Calibri"/>
+        </w:rPr>
+        <w:t xml:space="preserve">The product has a built-in demo mode, so you never have to take a learner through the whole session. Open </w:t>
+      </w:r>
+      <w:r>
+        <w:rPr>
+          <w:rFonts w:ascii="Calibri" w:cs="Calibri" w:eastAsia="Calibri" w:hAnsi="Calibri"/>
+          <w:b/>
+          <w:bCs/>
+          <w:color w:val="1F4E9E"/>
+        </w:rPr>
+        <w:t xml:space="preserve">https://excavation-virid.vercel.app/demo</w:t>
+      </w:r>
+      <w:r>
+        <w:rPr>
+          <w:rFonts w:ascii="Calibri" w:cs="Calibri" w:eastAsia="Calibri" w:hAnsi="Calibri"/>
+        </w:rPr>
+        <w:t xml:space="preserve"> (also linked as "Demo" in the footer of the home page). It needs no login and no internet services beyond the site itself.</w:t>
       </w:r>
     </w:p>
     <w:tbl>
@@ -3581,7 +3607,7 @@
                 <w:sz w:val="22"/>
                 <w:szCs w:val="22"/>
               </w:rPr>
-              <w:t xml:space="preserve">Rules for a safe demo</w:t>
+              <w:t xml:space="preserve">What the demo is, and is not</w:t>
             </w:r>
           </w:p>
           <w:p>
@@ -3592,7 +3618,7 @@
               <w:rPr>
                 <w:rFonts w:ascii="Calibri" w:cs="Calibri" w:eastAsia="Calibri" w:hAnsi="Calibri"/>
               </w:rPr>
-              <w:t xml:space="preserve">Use a seeded demonstration school and learner only. Never show a real child's data or a real safeguarding event.</w:t>
+              <w:t xml:space="preserve">It is the real interface: the same illustrated question cards, rating faces, read-aloud button, skill-check layout and report dashboard.</w:t>
             </w:r>
           </w:p>
           <w:p>
@@ -3603,7 +3629,7 @@
               <w:rPr>
                 <w:rFonts w:ascii="Calibri" w:cs="Calibri" w:eastAsia="Calibri" w:hAnsi="Calibri"/>
               </w:rPr>
-              <w:t xml:space="preserve">Log in twenty minutes beforehand on the same device and network, and keep that session open. Have a second browser logged in as staff.</w:t>
+              <w:t xml:space="preserve">The learner is fictional ("Lerato"). Nothing you tap is stored or sent anywhere. No AI is called.</w:t>
             </w:r>
           </w:p>
           <w:p>
@@ -3614,7 +3640,18 @@
               <w:rPr>
                 <w:rFonts w:ascii="Calibri" w:cs="Calibri" w:eastAsia="Calibri" w:hAnsi="Calibri"/>
               </w:rPr>
-              <w:t xml:space="preserve">Have the fallback ready (below) before you start. A good fallback is what lets you stay calm.</w:t>
+              <w:t xml:space="preserve">The Guide chat is scripted for the demo and says so on screen. The report charts are drawn by the real scoring engine; the report wording is the specification's sample report; the PDF is real.</w:t>
+            </w:r>
+          </w:p>
+          <w:p>
+            <w:pPr>
+              <w:spacing w:after="60" w:line="276"/>
+            </w:pPr>
+            <w:r>
+              <w:rPr>
+                <w:rFonts w:ascii="Calibri" w:cs="Calibri" w:eastAsia="Calibri" w:hAnsi="Calibri"/>
+              </w:rPr>
+              <w:t xml:space="preserve">Say these three things out loud. Being upfront about what is scripted is what makes the rest believable.</w:t>
             </w:r>
           </w:p>
         </w:tc>
@@ -3624,6 +3661,24 @@
       <w:pPr>
         <w:spacing w:after="80"/>
       </w:pPr>
+    </w:p>
+    <w:p>
+      <w:pPr>
+        <w:pStyle w:val="Heading2"/>
+        <w:keepNext/>
+        <w:spacing w:after="100" w:before="240"/>
+      </w:pPr>
+      <w:r>
+        <w:rPr>
+          <w:rFonts w:ascii="Calibri" w:cs="Calibri" w:eastAsia="Calibri" w:hAnsi="Calibri"/>
+          <w:b/>
+          <w:bCs/>
+          <w:color w:val="1F4E9E"/>
+          <w:sz w:val="26"/>
+          <w:szCs w:val="26"/>
+        </w:rPr>
+        <w:t xml:space="preserve">The three parts and the time budget</w:t>
+      </w:r>
     </w:p>
     <w:tbl>
       <w:tblPr>
@@ -3638,9 +3693,9 @@
         </w:tblBorders>
       </w:tblPr>
       <w:tblGrid>
-        <w:gridCol w:w="600"/>
-        <w:gridCol w:w="3200"/>
-        <w:gridCol w:w="5838"/>
+        <w:gridCol w:w="1500"/>
+        <w:gridCol w:w="2900"/>
+        <w:gridCol w:w="5238"/>
       </w:tblGrid>
       <w:tr>
         <w:trPr>
@@ -3648,7 +3703,7 @@
         </w:trPr>
         <w:tc>
           <w:tcPr>
-            <w:tcW w:type="dxa" w:w="600"/>
+            <w:tcW w:type="dxa" w:w="1500"/>
             <w:tcBorders>
               <w:top w:val="single" w:color="C5D3E8" w:sz="4"/>
               <w:left w:val="single" w:color="C5D3E8" w:sz="4"/>
@@ -3676,13 +3731,13 @@
                 <w:sz w:val="20"/>
                 <w:szCs w:val="20"/>
               </w:rPr>
-              <w:t xml:space="preserve">Min</w:t>
-            </w:r>
-          </w:p>
-        </w:tc>
-        <w:tc>
-          <w:tcPr>
-            <w:tcW w:type="dxa" w:w="3200"/>
+              <w:t xml:space="preserve">Time</w:t>
+            </w:r>
+          </w:p>
+        </w:tc>
+        <w:tc>
+          <w:tcPr>
+            <w:tcW w:type="dxa" w:w="2900"/>
             <w:tcBorders>
               <w:top w:val="single" w:color="C5D3E8" w:sz="4"/>
               <w:left w:val="single" w:color="C5D3E8" w:sz="4"/>
@@ -3710,13 +3765,13 @@
                 <w:sz w:val="20"/>
                 <w:szCs w:val="20"/>
               </w:rPr>
-              <w:t xml:space="preserve">Show</w:t>
-            </w:r>
-          </w:p>
-        </w:tc>
-        <w:tc>
-          <w:tcPr>
-            <w:tcW w:type="dxa" w:w="5838"/>
+              <w:t xml:space="preserve">Screen</w:t>
+            </w:r>
+          </w:p>
+        </w:tc>
+        <w:tc>
+          <w:tcPr>
+            <w:tcW w:type="dxa" w:w="5238"/>
             <w:tcBorders>
               <w:top w:val="single" w:color="C5D3E8" w:sz="4"/>
               <w:left w:val="single" w:color="C5D3E8" w:sz="4"/>
@@ -3744,7 +3799,7 @@
                 <w:sz w:val="20"/>
                 <w:szCs w:val="20"/>
               </w:rPr>
-              <w:t xml:space="preserve">What to point out</w:t>
+              <w:t xml:space="preserve">What to do and say</w:t>
             </w:r>
           </w:p>
         </w:tc>
@@ -3755,7 +3810,7 @@
         </w:trPr>
         <w:tc>
           <w:tcPr>
-            <w:tcW w:type="dxa" w:w="600"/>
+            <w:tcW w:type="dxa" w:w="1500"/>
             <w:tcBorders>
               <w:top w:val="single" w:color="C5D3E8" w:sz="4"/>
               <w:left w:val="single" w:color="C5D3E8" w:sz="4"/>
@@ -3782,73 +3837,105 @@
                 <w:sz w:val="20"/>
                 <w:szCs w:val="20"/>
               </w:rPr>
-              <w:t xml:space="preserve">0:00</w:t>
-            </w:r>
-          </w:p>
-        </w:tc>
-        <w:tc>
-          <w:tcPr>
-            <w:tcW w:type="dxa" w:w="3200"/>
-            <w:tcBorders>
-              <w:top w:val="single" w:color="C5D3E8" w:sz="4"/>
-              <w:left w:val="single" w:color="C5D3E8" w:sz="4"/>
-              <w:bottom w:val="single" w:color="C5D3E8" w:sz="4"/>
-              <w:right w:val="single" w:color="C5D3E8" w:sz="4"/>
-            </w:tcBorders>
-            <w:tcMar>
-              <w:top w:type="dxa" w:w="80"/>
-              <w:left w:type="dxa" w:w="110"/>
-              <w:bottom w:type="dxa" w:w="80"/>
-              <w:right w:type="dxa" w:w="110"/>
-            </w:tcMar>
-          </w:tcPr>
-          <w:p>
-            <w:pPr>
-              <w:spacing w:after="30"/>
-            </w:pPr>
-            <w:r>
-              <w:rPr>
-                <w:rFonts w:ascii="Calibri" w:cs="Calibri" w:eastAsia="Calibri" w:hAnsi="Calibri"/>
-                <w:b w:val="false"/>
-                <w:bCs w:val="false"/>
-                <w:color w:val="14213D"/>
-                <w:sz w:val="20"/>
-                <w:szCs w:val="20"/>
-              </w:rPr>
-              <w:t xml:space="preserve">Learner login page on a phone-size window</w:t>
-            </w:r>
-          </w:p>
-        </w:tc>
-        <w:tc>
-          <w:tcPr>
-            <w:tcW w:type="dxa" w:w="5838"/>
-            <w:tcBorders>
-              <w:top w:val="single" w:color="C5D3E8" w:sz="4"/>
-              <w:left w:val="single" w:color="C5D3E8" w:sz="4"/>
-              <w:bottom w:val="single" w:color="C5D3E8" w:sz="4"/>
-              <w:right w:val="single" w:color="C5D3E8" w:sz="4"/>
-            </w:tcBorders>
-            <w:tcMar>
-              <w:top w:type="dxa" w:w="80"/>
-              <w:left w:type="dxa" w:w="110"/>
-              <w:bottom w:type="dxa" w:w="80"/>
-              <w:right w:type="dxa" w:w="110"/>
-            </w:tcMar>
-          </w:tcPr>
-          <w:p>
-            <w:pPr>
-              <w:spacing w:after="30"/>
-            </w:pPr>
-            <w:r>
-              <w:rPr>
-                <w:rFonts w:ascii="Calibri" w:cs="Calibri" w:eastAsia="Calibri" w:hAnsi="Calibri"/>
-                <w:b w:val="false"/>
-                <w:bCs w:val="false"/>
-                <w:color w:val="14213D"/>
-                <w:sz w:val="20"/>
-                <w:szCs w:val="20"/>
-              </w:rPr>
-              <w:t xml:space="preserve">Two codes, no email or password for a child. Works on a phone.</w:t>
+              <w:t xml:space="preserve">0:00 to 1:30</w:t>
+            </w:r>
+          </w:p>
+          <w:p>
+            <w:pPr>
+              <w:spacing w:after="30"/>
+            </w:pPr>
+            <w:r>
+              <w:rPr>
+                <w:rFonts w:ascii="Calibri" w:cs="Calibri" w:eastAsia="Calibri" w:hAnsi="Calibri"/>
+                <w:b/>
+                <w:bCs/>
+                <w:color w:val="14213D"/>
+                <w:sz w:val="20"/>
+                <w:szCs w:val="20"/>
+              </w:rPr>
+              <w:t xml:space="preserve">Part 1</w:t>
+            </w:r>
+          </w:p>
+          <w:p>
+            <w:pPr>
+              <w:spacing w:after="30"/>
+            </w:pPr>
+            <w:r>
+              <w:rPr>
+                <w:rFonts w:ascii="Calibri" w:cs="Calibri" w:eastAsia="Calibri" w:hAnsi="Calibri"/>
+                <w:b/>
+                <w:bCs/>
+                <w:color w:val="14213D"/>
+                <w:sz w:val="20"/>
+                <w:szCs w:val="20"/>
+              </w:rPr>
+              <w:t xml:space="preserve">Know yourself</w:t>
+            </w:r>
+          </w:p>
+        </w:tc>
+        <w:tc>
+          <w:tcPr>
+            <w:tcW w:type="dxa" w:w="2900"/>
+            <w:tcBorders>
+              <w:top w:val="single" w:color="C5D3E8" w:sz="4"/>
+              <w:left w:val="single" w:color="C5D3E8" w:sz="4"/>
+              <w:bottom w:val="single" w:color="C5D3E8" w:sz="4"/>
+              <w:right w:val="single" w:color="C5D3E8" w:sz="4"/>
+            </w:tcBorders>
+            <w:tcMar>
+              <w:top w:type="dxa" w:w="80"/>
+              <w:left w:type="dxa" w:w="110"/>
+              <w:bottom w:type="dxa" w:w="80"/>
+              <w:right w:type="dxa" w:w="110"/>
+            </w:tcMar>
+          </w:tcPr>
+          <w:p>
+            <w:pPr>
+              <w:spacing w:after="30"/>
+            </w:pPr>
+            <w:r>
+              <w:rPr>
+                <w:rFonts w:ascii="Calibri" w:cs="Calibri" w:eastAsia="Calibri" w:hAnsi="Calibri"/>
+                <w:b w:val="false"/>
+                <w:bCs w:val="false"/>
+                <w:color w:val="14213D"/>
+                <w:sz w:val="20"/>
+                <w:szCs w:val="20"/>
+              </w:rPr>
+              <w:t xml:space="preserve">Three real questions, then a values pick</w:t>
+            </w:r>
+          </w:p>
+        </w:tc>
+        <w:tc>
+          <w:tcPr>
+            <w:tcW w:type="dxa" w:w="5238"/>
+            <w:tcBorders>
+              <w:top w:val="single" w:color="C5D3E8" w:sz="4"/>
+              <w:left w:val="single" w:color="C5D3E8" w:sz="4"/>
+              <w:bottom w:val="single" w:color="C5D3E8" w:sz="4"/>
+              <w:right w:val="single" w:color="C5D3E8" w:sz="4"/>
+            </w:tcBorders>
+            <w:tcMar>
+              <w:top w:type="dxa" w:w="80"/>
+              <w:left w:type="dxa" w:w="110"/>
+              <w:bottom w:type="dxa" w:w="80"/>
+              <w:right w:type="dxa" w:w="110"/>
+            </w:tcMar>
+          </w:tcPr>
+          <w:p>
+            <w:pPr>
+              <w:spacing w:after="30"/>
+            </w:pPr>
+            <w:r>
+              <w:rPr>
+                <w:rFonts w:ascii="Calibri" w:cs="Calibri" w:eastAsia="Calibri" w:hAnsi="Calibri"/>
+                <w:b w:val="false"/>
+                <w:bCs w:val="false"/>
+                <w:color w:val="14213D"/>
+                <w:sz w:val="20"/>
+                <w:szCs w:val="20"/>
+              </w:rPr>
+              <w:t xml:space="preserve">Tap an answer on the first question. Press Listen: it uses the phone's own voice and nothing is sent anywhere. Point out the picture, the large type and the faces. Answer the second question, then pick three values that matter most. Say: "Every answer feeds a private picture of how the learner is wired. No scores are ever shown back to the learner."</w:t>
             </w:r>
           </w:p>
         </w:tc>
@@ -3859,7 +3946,7 @@
         </w:trPr>
         <w:tc>
           <w:tcPr>
-            <w:tcW w:type="dxa" w:w="600"/>
+            <w:tcW w:type="dxa" w:w="1500"/>
             <w:tcBorders>
               <w:top w:val="single" w:color="C5D3E8" w:sz="4"/>
               <w:left w:val="single" w:color="C5D3E8" w:sz="4"/>
@@ -3887,13 +3974,45 @@
                 <w:sz w:val="20"/>
                 <w:szCs w:val="20"/>
               </w:rPr>
-              <w:t xml:space="preserve">0:45</w:t>
-            </w:r>
-          </w:p>
-        </w:tc>
-        <w:tc>
-          <w:tcPr>
-            <w:tcW w:type="dxa" w:w="3200"/>
+              <w:t xml:space="preserve">1:30 to 3:30</w:t>
+            </w:r>
+          </w:p>
+          <w:p>
+            <w:pPr>
+              <w:spacing w:after="30"/>
+            </w:pPr>
+            <w:r>
+              <w:rPr>
+                <w:rFonts w:ascii="Calibri" w:cs="Calibri" w:eastAsia="Calibri" w:hAnsi="Calibri"/>
+                <w:b/>
+                <w:bCs/>
+                <w:color w:val="14213D"/>
+                <w:sz w:val="20"/>
+                <w:szCs w:val="20"/>
+              </w:rPr>
+              <w:t xml:space="preserve">Part 2</w:t>
+            </w:r>
+          </w:p>
+          <w:p>
+            <w:pPr>
+              <w:spacing w:after="30"/>
+            </w:pPr>
+            <w:r>
+              <w:rPr>
+                <w:rFonts w:ascii="Calibri" w:cs="Calibri" w:eastAsia="Calibri" w:hAnsi="Calibri"/>
+                <w:b/>
+                <w:bCs/>
+                <w:color w:val="14213D"/>
+                <w:sz w:val="20"/>
+                <w:szCs w:val="20"/>
+              </w:rPr>
+              <w:t xml:space="preserve">Try it, then talk</w:t>
+            </w:r>
+          </w:p>
+        </w:tc>
+        <w:tc>
+          <w:tcPr>
+            <w:tcW w:type="dxa" w:w="2900"/>
             <w:tcBorders>
               <w:top w:val="single" w:color="C5D3E8" w:sz="4"/>
               <w:left w:val="single" w:color="C5D3E8" w:sz="4"/>
@@ -3921,13 +4040,13 @@
                 <w:sz w:val="20"/>
                 <w:szCs w:val="20"/>
               </w:rPr>
-              <w:t xml:space="preserve">One illustrated question; press Listen</w:t>
-            </w:r>
-          </w:p>
-        </w:tc>
-        <w:tc>
-          <w:tcPr>
-            <w:tcW w:type="dxa" w:w="5838"/>
+              <w:t xml:space="preserve">One maths check, then the Guide chat</w:t>
+            </w:r>
+          </w:p>
+        </w:tc>
+        <w:tc>
+          <w:tcPr>
+            <w:tcW w:type="dxa" w:w="5238"/>
             <w:tcBorders>
               <w:top w:val="single" w:color="C5D3E8" w:sz="4"/>
               <w:left w:val="single" w:color="C5D3E8" w:sz="4"/>
@@ -3955,7 +4074,7 @@
                 <w:sz w:val="20"/>
                 <w:szCs w:val="20"/>
               </w:rPr>
-              <w:t xml:space="preserve">Large, framed questions with pictures. Read-aloud uses the phone's own voice; nothing is sent anywhere.</w:t>
+              <w:t xml:space="preserve">Answer the ladder question (the diagram only shows what the question already says). Say: "A check can only help a learner. A low score never lowers anything." Press the button to start the Guide. Tap the two suggested replies. Point at the safety badge under each learner message: "Every message is checked for safety before the Guide sees it."</w:t>
             </w:r>
           </w:p>
         </w:tc>
@@ -3966,7 +4085,7 @@
         </w:trPr>
         <w:tc>
           <w:tcPr>
-            <w:tcW w:type="dxa" w:w="600"/>
+            <w:tcW w:type="dxa" w:w="1500"/>
             <w:tcBorders>
               <w:top w:val="single" w:color="C5D3E8" w:sz="4"/>
               <w:left w:val="single" w:color="C5D3E8" w:sz="4"/>
@@ -3993,98 +4112,9 @@
                 <w:sz w:val="20"/>
                 <w:szCs w:val="20"/>
               </w:rPr>
-              <w:t xml:space="preserve">1:45</w:t>
-            </w:r>
-          </w:p>
-        </w:tc>
-        <w:tc>
-          <w:tcPr>
-            <w:tcW w:type="dxa" w:w="3200"/>
-            <w:tcBorders>
-              <w:top w:val="single" w:color="C5D3E8" w:sz="4"/>
-              <w:left w:val="single" w:color="C5D3E8" w:sz="4"/>
-              <w:bottom w:val="single" w:color="C5D3E8" w:sz="4"/>
-              <w:right w:val="single" w:color="C5D3E8" w:sz="4"/>
-            </w:tcBorders>
-            <w:tcMar>
-              <w:top w:type="dxa" w:w="80"/>
-              <w:left w:type="dxa" w:w="110"/>
-              <w:bottom w:type="dxa" w:w="80"/>
-              <w:right w:type="dxa" w:w="110"/>
-            </w:tcMar>
-          </w:tcPr>
-          <w:p>
-            <w:pPr>
-              <w:spacing w:after="30"/>
-            </w:pPr>
-            <w:r>
-              <w:rPr>
-                <w:rFonts w:ascii="Calibri" w:cs="Calibri" w:eastAsia="Calibri" w:hAnsi="Calibri"/>
-                <w:b w:val="false"/>
-                <w:bCs w:val="false"/>
-                <w:color w:val="14213D"/>
-                <w:sz w:val="20"/>
-                <w:szCs w:val="20"/>
-              </w:rPr>
-              <w:t xml:space="preserve">A skill check or taster</w:t>
-            </w:r>
-          </w:p>
-        </w:tc>
-        <w:tc>
-          <w:tcPr>
-            <w:tcW w:type="dxa" w:w="5838"/>
-            <w:tcBorders>
-              <w:top w:val="single" w:color="C5D3E8" w:sz="4"/>
-              <w:left w:val="single" w:color="C5D3E8" w:sz="4"/>
-              <w:bottom w:val="single" w:color="C5D3E8" w:sz="4"/>
-              <w:right w:val="single" w:color="C5D3E8" w:sz="4"/>
-            </w:tcBorders>
-            <w:tcMar>
-              <w:top w:type="dxa" w:w="80"/>
-              <w:left w:type="dxa" w:w="110"/>
-              <w:bottom w:type="dxa" w:w="80"/>
-              <w:right w:type="dxa" w:w="110"/>
-            </w:tcMar>
-          </w:tcPr>
-          <w:p>
-            <w:pPr>
-              <w:spacing w:after="30"/>
-            </w:pPr>
-            <w:r>
-              <w:rPr>
-                <w:rFonts w:ascii="Calibri" w:cs="Calibri" w:eastAsia="Calibri" w:hAnsi="Calibri"/>
-                <w:b w:val="false"/>
-                <w:bCs w:val="false"/>
-                <w:color w:val="14213D"/>
-                <w:sz w:val="20"/>
-                <w:szCs w:val="20"/>
-              </w:rPr>
-              <w:t xml:space="preserve">Doing, not just opinions. Pictures only show what the question already says.</w:t>
-            </w:r>
-          </w:p>
-        </w:tc>
-      </w:tr>
-      <w:tr>
-        <w:trPr>
-          <w:cantSplit/>
-        </w:trPr>
-        <w:tc>
-          <w:tcPr>
-            <w:tcW w:type="dxa" w:w="600"/>
-            <w:tcBorders>
-              <w:top w:val="single" w:color="C5D3E8" w:sz="4"/>
-              <w:left w:val="single" w:color="C5D3E8" w:sz="4"/>
-              <w:bottom w:val="single" w:color="C5D3E8" w:sz="4"/>
-              <w:right w:val="single" w:color="C5D3E8" w:sz="4"/>
-            </w:tcBorders>
-            <w:shd w:fill="F6F9FD" w:color="auto" w:val="clear"/>
-            <w:tcMar>
-              <w:top w:type="dxa" w:w="80"/>
-              <w:left w:type="dxa" w:w="110"/>
-              <w:bottom w:type="dxa" w:w="80"/>
-              <w:right w:type="dxa" w:w="110"/>
-            </w:tcMar>
-          </w:tcPr>
+              <w:t xml:space="preserve">3:30 to 5:00</w:t>
+            </w:r>
+          </w:p>
           <w:p>
             <w:pPr>
               <w:spacing w:after="30"/>
@@ -4098,286 +4128,73 @@
                 <w:sz w:val="20"/>
                 <w:szCs w:val="20"/>
               </w:rPr>
-              <w:t xml:space="preserve">2:30</w:t>
-            </w:r>
-          </w:p>
-        </w:tc>
-        <w:tc>
-          <w:tcPr>
-            <w:tcW w:type="dxa" w:w="3200"/>
-            <w:tcBorders>
-              <w:top w:val="single" w:color="C5D3E8" w:sz="4"/>
-              <w:left w:val="single" w:color="C5D3E8" w:sz="4"/>
-              <w:bottom w:val="single" w:color="C5D3E8" w:sz="4"/>
-              <w:right w:val="single" w:color="C5D3E8" w:sz="4"/>
-            </w:tcBorders>
-            <w:shd w:fill="F6F9FD" w:color="auto" w:val="clear"/>
-            <w:tcMar>
-              <w:top w:type="dxa" w:w="80"/>
-              <w:left w:type="dxa" w:w="110"/>
-              <w:bottom w:type="dxa" w:w="80"/>
-              <w:right w:type="dxa" w:w="110"/>
-            </w:tcMar>
-          </w:tcPr>
-          <w:p>
-            <w:pPr>
-              <w:spacing w:after="30"/>
-            </w:pPr>
-            <w:r>
-              <w:rPr>
-                <w:rFonts w:ascii="Calibri" w:cs="Calibri" w:eastAsia="Calibri" w:hAnsi="Calibri"/>
-                <w:b w:val="false"/>
-                <w:bCs w:val="false"/>
-                <w:color w:val="14213D"/>
-                <w:sz w:val="20"/>
-                <w:szCs w:val="20"/>
-              </w:rPr>
-              <w:t xml:space="preserve">The Guide (use a prepared exchange)</w:t>
-            </w:r>
-          </w:p>
-        </w:tc>
-        <w:tc>
-          <w:tcPr>
-            <w:tcW w:type="dxa" w:w="5838"/>
-            <w:tcBorders>
-              <w:top w:val="single" w:color="C5D3E8" w:sz="4"/>
-              <w:left w:val="single" w:color="C5D3E8" w:sz="4"/>
-              <w:bottom w:val="single" w:color="C5D3E8" w:sz="4"/>
-              <w:right w:val="single" w:color="C5D3E8" w:sz="4"/>
-            </w:tcBorders>
-            <w:shd w:fill="F6F9FD" w:color="auto" w:val="clear"/>
-            <w:tcMar>
-              <w:top w:type="dxa" w:w="80"/>
-              <w:left w:type="dxa" w:w="110"/>
-              <w:bottom w:type="dxa" w:w="80"/>
-              <w:right w:type="dxa" w:w="110"/>
-            </w:tcMar>
-          </w:tcPr>
-          <w:p>
-            <w:pPr>
-              <w:spacing w:after="30"/>
-            </w:pPr>
-            <w:r>
-              <w:rPr>
-                <w:rFonts w:ascii="Calibri" w:cs="Calibri" w:eastAsia="Calibri" w:hAnsi="Calibri"/>
-                <w:b w:val="false"/>
-                <w:bCs w:val="false"/>
-                <w:color w:val="14213D"/>
-                <w:sz w:val="20"/>
-                <w:szCs w:val="20"/>
-              </w:rPr>
-              <w:t xml:space="preserve">Plain language. Mention the safety screen running on every message before the AI replies.</w:t>
-            </w:r>
-          </w:p>
-        </w:tc>
-      </w:tr>
-      <w:tr>
-        <w:trPr>
-          <w:cantSplit/>
-        </w:trPr>
-        <w:tc>
-          <w:tcPr>
-            <w:tcW w:type="dxa" w:w="600"/>
-            <w:tcBorders>
-              <w:top w:val="single" w:color="C5D3E8" w:sz="4"/>
-              <w:left w:val="single" w:color="C5D3E8" w:sz="4"/>
-              <w:bottom w:val="single" w:color="C5D3E8" w:sz="4"/>
-              <w:right w:val="single" w:color="C5D3E8" w:sz="4"/>
-            </w:tcBorders>
-            <w:tcMar>
-              <w:top w:type="dxa" w:w="80"/>
-              <w:left w:type="dxa" w:w="110"/>
-              <w:bottom w:type="dxa" w:w="80"/>
-              <w:right w:type="dxa" w:w="110"/>
-            </w:tcMar>
-          </w:tcPr>
-          <w:p>
-            <w:pPr>
-              <w:spacing w:after="30"/>
-            </w:pPr>
-            <w:r>
-              <w:rPr>
-                <w:rFonts w:ascii="Calibri" w:cs="Calibri" w:eastAsia="Calibri" w:hAnsi="Calibri"/>
-                <w:b/>
-                <w:bCs/>
-                <w:color w:val="14213D"/>
-                <w:sz w:val="20"/>
-                <w:szCs w:val="20"/>
-              </w:rPr>
-              <w:t xml:space="preserve">3:30</w:t>
-            </w:r>
-          </w:p>
-        </w:tc>
-        <w:tc>
-          <w:tcPr>
-            <w:tcW w:type="dxa" w:w="3200"/>
-            <w:tcBorders>
-              <w:top w:val="single" w:color="C5D3E8" w:sz="4"/>
-              <w:left w:val="single" w:color="C5D3E8" w:sz="4"/>
-              <w:bottom w:val="single" w:color="C5D3E8" w:sz="4"/>
-              <w:right w:val="single" w:color="C5D3E8" w:sz="4"/>
-            </w:tcBorders>
-            <w:tcMar>
-              <w:top w:type="dxa" w:w="80"/>
-              <w:left w:type="dxa" w:w="110"/>
-              <w:bottom w:type="dxa" w:w="80"/>
-              <w:right w:type="dxa" w:w="110"/>
-            </w:tcMar>
-          </w:tcPr>
-          <w:p>
-            <w:pPr>
-              <w:spacing w:after="30"/>
-            </w:pPr>
-            <w:r>
-              <w:rPr>
-                <w:rFonts w:ascii="Calibri" w:cs="Calibri" w:eastAsia="Calibri" w:hAnsi="Calibri"/>
-                <w:b w:val="false"/>
-                <w:bCs w:val="false"/>
-                <w:color w:val="14213D"/>
-                <w:sz w:val="20"/>
-                <w:szCs w:val="20"/>
-              </w:rPr>
-              <w:t xml:space="preserve">The learner report and PDF</w:t>
-            </w:r>
-          </w:p>
-        </w:tc>
-        <w:tc>
-          <w:tcPr>
-            <w:tcW w:type="dxa" w:w="5838"/>
-            <w:tcBorders>
-              <w:top w:val="single" w:color="C5D3E8" w:sz="4"/>
-              <w:left w:val="single" w:color="C5D3E8" w:sz="4"/>
-              <w:bottom w:val="single" w:color="C5D3E8" w:sz="4"/>
-              <w:right w:val="single" w:color="C5D3E8" w:sz="4"/>
-            </w:tcBorders>
-            <w:tcMar>
-              <w:top w:type="dxa" w:w="80"/>
-              <w:left w:type="dxa" w:w="110"/>
-              <w:bottom w:type="dxa" w:w="80"/>
-              <w:right w:type="dxa" w:w="110"/>
-            </w:tcMar>
-          </w:tcPr>
-          <w:p>
-            <w:pPr>
-              <w:spacing w:after="30"/>
-            </w:pPr>
-            <w:r>
-              <w:rPr>
-                <w:rFonts w:ascii="Calibri" w:cs="Calibri" w:eastAsia="Calibri" w:hAnsi="Calibri"/>
-                <w:b w:val="false"/>
-                <w:bCs w:val="false"/>
-                <w:color w:val="14213D"/>
-                <w:sz w:val="20"/>
-                <w:szCs w:val="20"/>
-              </w:rPr>
-              <w:t xml:space="preserve">Charts, named stages, no percentages. Download the PDF.</w:t>
-            </w:r>
-          </w:p>
-        </w:tc>
-      </w:tr>
-      <w:tr>
-        <w:trPr>
-          <w:cantSplit/>
-        </w:trPr>
-        <w:tc>
-          <w:tcPr>
-            <w:tcW w:type="dxa" w:w="600"/>
-            <w:tcBorders>
-              <w:top w:val="single" w:color="C5D3E8" w:sz="4"/>
-              <w:left w:val="single" w:color="C5D3E8" w:sz="4"/>
-              <w:bottom w:val="single" w:color="C5D3E8" w:sz="4"/>
-              <w:right w:val="single" w:color="C5D3E8" w:sz="4"/>
-            </w:tcBorders>
-            <w:shd w:fill="F6F9FD" w:color="auto" w:val="clear"/>
-            <w:tcMar>
-              <w:top w:type="dxa" w:w="80"/>
-              <w:left w:type="dxa" w:w="110"/>
-              <w:bottom w:type="dxa" w:w="80"/>
-              <w:right w:type="dxa" w:w="110"/>
-            </w:tcMar>
-          </w:tcPr>
-          <w:p>
-            <w:pPr>
-              <w:spacing w:after="30"/>
-            </w:pPr>
-            <w:r>
-              <w:rPr>
-                <w:rFonts w:ascii="Calibri" w:cs="Calibri" w:eastAsia="Calibri" w:hAnsi="Calibri"/>
-                <w:b/>
-                <w:bCs/>
-                <w:color w:val="14213D"/>
-                <w:sz w:val="20"/>
-                <w:szCs w:val="20"/>
-              </w:rPr>
-              <w:t xml:space="preserve">4:30</w:t>
-            </w:r>
-          </w:p>
-        </w:tc>
-        <w:tc>
-          <w:tcPr>
-            <w:tcW w:type="dxa" w:w="3200"/>
-            <w:tcBorders>
-              <w:top w:val="single" w:color="C5D3E8" w:sz="4"/>
-              <w:left w:val="single" w:color="C5D3E8" w:sz="4"/>
-              <w:bottom w:val="single" w:color="C5D3E8" w:sz="4"/>
-              <w:right w:val="single" w:color="C5D3E8" w:sz="4"/>
-            </w:tcBorders>
-            <w:shd w:fill="F6F9FD" w:color="auto" w:val="clear"/>
-            <w:tcMar>
-              <w:top w:type="dxa" w:w="80"/>
-              <w:left w:type="dxa" w:w="110"/>
-              <w:bottom w:type="dxa" w:w="80"/>
-              <w:right w:type="dxa" w:w="110"/>
-            </w:tcMar>
-          </w:tcPr>
-          <w:p>
-            <w:pPr>
-              <w:spacing w:after="30"/>
-            </w:pPr>
-            <w:r>
-              <w:rPr>
-                <w:rFonts w:ascii="Calibri" w:cs="Calibri" w:eastAsia="Calibri" w:hAnsi="Calibri"/>
-                <w:b w:val="false"/>
-                <w:bCs w:val="false"/>
-                <w:color w:val="14213D"/>
-                <w:sz w:val="20"/>
-                <w:szCs w:val="20"/>
-              </w:rPr>
-              <w:t xml:space="preserve">Staff view: consent register or the safeguarding dashboard</w:t>
-            </w:r>
-          </w:p>
-        </w:tc>
-        <w:tc>
-          <w:tcPr>
-            <w:tcW w:type="dxa" w:w="5838"/>
-            <w:tcBorders>
-              <w:top w:val="single" w:color="C5D3E8" w:sz="4"/>
-              <w:left w:val="single" w:color="C5D3E8" w:sz="4"/>
-              <w:bottom w:val="single" w:color="C5D3E8" w:sz="4"/>
-              <w:right w:val="single" w:color="C5D3E8" w:sz="4"/>
-            </w:tcBorders>
-            <w:shd w:fill="F6F9FD" w:color="auto" w:val="clear"/>
-            <w:tcMar>
-              <w:top w:type="dxa" w:w="80"/>
-              <w:left w:type="dxa" w:w="110"/>
-              <w:bottom w:type="dxa" w:w="80"/>
-              <w:right w:type="dxa" w:w="110"/>
-            </w:tcMar>
-          </w:tcPr>
-          <w:p>
-            <w:pPr>
-              <w:spacing w:after="30"/>
-            </w:pPr>
-            <w:r>
-              <w:rPr>
-                <w:rFonts w:ascii="Calibri" w:cs="Calibri" w:eastAsia="Calibri" w:hAnsi="Calibri"/>
-                <w:b w:val="false"/>
-                <w:bCs w:val="false"/>
-                <w:color w:val="14213D"/>
-                <w:sz w:val="20"/>
-                <w:szCs w:val="20"/>
-              </w:rPr>
-              <w:t xml:space="preserve">Consent per learner, the audit trail, the alert path. Keep it to one screen.</w:t>
+              <w:t xml:space="preserve">Final results</w:t>
+            </w:r>
+          </w:p>
+        </w:tc>
+        <w:tc>
+          <w:tcPr>
+            <w:tcW w:type="dxa" w:w="2900"/>
+            <w:tcBorders>
+              <w:top w:val="single" w:color="C5D3E8" w:sz="4"/>
+              <w:left w:val="single" w:color="C5D3E8" w:sz="4"/>
+              <w:bottom w:val="single" w:color="C5D3E8" w:sz="4"/>
+              <w:right w:val="single" w:color="C5D3E8" w:sz="4"/>
+            </w:tcBorders>
+            <w:tcMar>
+              <w:top w:type="dxa" w:w="80"/>
+              <w:left w:type="dxa" w:w="110"/>
+              <w:bottom w:type="dxa" w:w="80"/>
+              <w:right w:type="dxa" w:w="110"/>
+            </w:tcMar>
+          </w:tcPr>
+          <w:p>
+            <w:pPr>
+              <w:spacing w:after="30"/>
+            </w:pPr>
+            <w:r>
+              <w:rPr>
+                <w:rFonts w:ascii="Calibri" w:cs="Calibri" w:eastAsia="Calibri" w:hAnsi="Calibri"/>
+                <w:b w:val="false"/>
+                <w:bCs w:val="false"/>
+                <w:color w:val="14213D"/>
+                <w:sz w:val="20"/>
+                <w:szCs w:val="20"/>
+              </w:rPr>
+              <w:t xml:space="preserve">The finished sample report</w:t>
+            </w:r>
+          </w:p>
+        </w:tc>
+        <w:tc>
+          <w:tcPr>
+            <w:tcW w:type="dxa" w:w="5238"/>
+            <w:tcBorders>
+              <w:top w:val="single" w:color="C5D3E8" w:sz="4"/>
+              <w:left w:val="single" w:color="C5D3E8" w:sz="4"/>
+              <w:bottom w:val="single" w:color="C5D3E8" w:sz="4"/>
+              <w:right w:val="single" w:color="C5D3E8" w:sz="4"/>
+            </w:tcBorders>
+            <w:tcMar>
+              <w:top w:type="dxa" w:w="80"/>
+              <w:left w:type="dxa" w:w="110"/>
+              <w:bottom w:type="dxa" w:w="80"/>
+              <w:right w:type="dxa" w:w="110"/>
+            </w:tcMar>
+          </w:tcPr>
+          <w:p>
+            <w:pPr>
+              <w:spacing w:after="30"/>
+            </w:pPr>
+            <w:r>
+              <w:rPr>
+                <w:rFonts w:ascii="Calibri" w:cs="Calibri" w:eastAsia="Calibri" w:hAnsi="Calibri"/>
+                <w:b w:val="false"/>
+                <w:bCs w:val="false"/>
+                <w:color w:val="14213D"/>
+                <w:sz w:val="20"/>
+                <w:szCs w:val="20"/>
+              </w:rPr>
+              <w:t xml:space="preserve">Let the headline land. Scroll through: interests, how they work, best-fit subjects, doors kept open, one thing to do this week. Press Download the PDF. Say: "This is what a learner keeps, after a human reviewer has read it."</w:t>
             </w:r>
           </w:p>
         </w:tc>
@@ -4387,6 +4204,17 @@
       <w:pPr>
         <w:spacing w:after="80"/>
       </w:pPr>
+    </w:p>
+    <w:p>
+      <w:pPr>
+        <w:spacing w:after="120" w:line="288"/>
+      </w:pPr>
+      <w:r>
+        <w:rPr>
+          <w:rFonts w:ascii="Calibri" w:cs="Calibri" w:eastAsia="Calibri" w:hAnsi="Calibri"/>
+        </w:rPr>
+        <w:t xml:space="preserve">The home screen of the demo also has a collapsible Presenter notes card with this same timing, so you can glance at it on the day.</w:t>
+      </w:r>
     </w:p>
     <w:p>
       <w:pPr>
@@ -4419,7 +4247,7 @@
         <w:rPr>
           <w:rFonts w:ascii="Calibri" w:cs="Calibri" w:eastAsia="Calibri" w:hAnsi="Calibri"/>
         </w:rPr>
-        <w:t xml:space="preserve">Keep screenshots of every screen above on slides 3b to 3g, and a sample PDF report open in another window.</w:t>
+        <w:t xml:space="preserve">Keep screenshots of each of the three parts and the sample PDF in a folder on your desktop. If the site or the network is down, show those and say so.</w:t>
       </w:r>
     </w:p>
     <w:p>
@@ -4435,7 +4263,7 @@
         <w:rPr>
           <w:rFonts w:ascii="Calibri" w:cs="Calibri" w:eastAsia="Calibri" w:hAnsi="Calibri"/>
         </w:rPr>
-        <w:t xml:space="preserve">Say: "The network is not cooperating, so let me show you what you would be seeing." Then continue. Do not debug in front of the room.</w:t>
+        <w:t xml:space="preserve">The demo needs only the website to be up. It does not use the database or the AI service, so those being down does not affect it.</w:t>
       </w:r>
     </w:p>
     <w:p>
@@ -4451,7 +4279,7 @@
         <w:rPr>
           <w:rFonts w:ascii="Calibri" w:cs="Calibri" w:eastAsia="Calibri" w:hAnsi="Calibri"/>
         </w:rPr>
-        <w:t xml:space="preserve">If the Guide is slow or unavailable, say so: it is designed to fail safely. A message is never sent to the AI unscreened, and learners can finish the scored sections without it. That is a feature worth explaining.</w:t>
+        <w:t xml:space="preserve">Open the three demo pages in separate tabs before you start, so you are not waiting for pages to load in front of the room.</w:t>
       </w:r>
     </w:p>
     <w:p>
@@ -4469,7 +4297,7 @@
           <w:sz w:val="26"/>
           <w:szCs w:val="26"/>
         </w:rPr>
-        <w:t xml:space="preserve">Do not demo</w:t>
+        <w:t xml:space="preserve">What to show only as a diagram</w:t>
       </w:r>
     </w:p>
     <w:p>
@@ -4485,7 +4313,7 @@
         <w:rPr>
           <w:rFonts w:ascii="Calibri" w:cs="Calibri" w:eastAsia="Calibri" w:hAnsi="Calibri"/>
         </w:rPr>
-        <w:t xml:space="preserve">A real safeguarding alert being triggered. Describe it with a diagram instead.</w:t>
+        <w:t xml:space="preserve">A real safeguarding alert. Describe it with the flow on slide 5 instead: screen, school confirmation, four-hour escalation.</w:t>
       </w:r>
     </w:p>
     <w:p>
@@ -4501,7 +4329,7 @@
         <w:rPr>
           <w:rFonts w:ascii="Calibri" w:cs="Calibri" w:eastAsia="Calibri" w:hAnsi="Calibri"/>
         </w:rPr>
-        <w:t xml:space="preserve">Anything that depends on the AI key, the database, and your Wi-Fi working live in a sequence you cannot rehearse.</w:t>
+        <w:t xml:space="preserve">The staff dashboards, unless you have a seeded demonstration school. Never show a real child's data.</w:t>
       </w:r>
     </w:p>
     <w:p>
@@ -4799,7 +4627,7 @@
                 <w:sz w:val="20"/>
                 <w:szCs w:val="20"/>
               </w:rPr>
-              <w:t xml:space="preserve">25 browser tests, including accessibility (WCAG A/AA) on every public page in light and dark mode</w:t>
+              <w:t xml:space="preserve">34 browser tests, including accessibility (WCAG A/AA) on every public page and every demo screen in light and dark mode</w:t>
             </w:r>
           </w:p>
         </w:tc>

</xml_diff>